<commit_message>
Add author name (Kartik Chilkoti) to paper
</commit_message>
<xml_diff>
--- a/paper/Agentic_AI_Reliability_Paper.docx
+++ b/paper/Agentic_AI_Reliability_Paper.docx
@@ -39,12 +39,10 @@
       </w:pPr>
       <w:r>
         <w:rPr>
-          <w:i/>
-          <w:iCs/>
-          <w:sz w:val="21"/>
-          <w:szCs w:val="21"/>
-        </w:rPr>
-        <w:t xml:space="preserve">Independent Research Report — Draft for Preprint Submission</w:t>
+          <w:sz w:val="22"/>
+          <w:szCs w:val="22"/>
+        </w:rPr>
+        <w:t xml:space="preserve">Kartik Chilkoti</w:t>
       </w:r>
     </w:p>
     <w:p>

</xml_diff>